<commit_message>
docs: finalize project documentation, submission checklist, schema DDL, and empirical benchmark data
</commit_message>
<xml_diff>
--- a/DCIT_308_Industry_Project_Checklist_Cover_Sheet.docx
+++ b/DCIT_308_Industry_Project_Checklist_Cover_Sheet.docx
@@ -80,7 +80,11 @@
           <w:tcPr>
             <w:tcW w:w="5184" w:type="dxa"/>
           </w:tcPr>
-          <w:p/>
+          <w:p>
+            <w:r>
+              <w:t>Ghana Smart Logistics Team (Group 5 / MindCraft)</w:t>
+            </w:r>
+          </w:p>
         </w:tc>
       </w:tr>
       <w:tr>
@@ -105,7 +109,11 @@
           <w:tcPr>
             <w:tcW w:w="5184" w:type="dxa"/>
           </w:tcPr>
-          <w:p/>
+          <w:p>
+            <w:r>
+              <w:t>Courier and food delivery service in Greater Accra (Accra, Legon Campus, East Legon, Osu, Spintex, Makola)</w:t>
+            </w:r>
+          </w:p>
         </w:tc>
       </w:tr>
       <w:tr>
@@ -130,7 +138,11 @@
           <w:tcPr>
             <w:tcW w:w="5184" w:type="dxa"/>
           </w:tcPr>
-          <w:p/>
+          <w:p>
+            <w:r>
+              <w:t>Ghana Smart Food &amp; Parcel Delivery Operations Optimizer</w:t>
+            </w:r>
+          </w:p>
         </w:tc>
       </w:tr>
       <w:tr>
@@ -155,7 +167,11 @@
           <w:tcPr>
             <w:tcW w:w="5184" w:type="dxa"/>
           </w:tcPr>
-          <w:p/>
+          <w:p>
+            <w:r>
+              <w:t>SQLite (jdbc:sqlite:dsa_optimizer.db) with PostgreSQL fallback capability</w:t>
+            </w:r>
+          </w:p>
         </w:tc>
       </w:tr>
       <w:tr>
@@ -180,7 +196,11 @@
           <w:tcPr>
             <w:tcW w:w="5184" w:type="dxa"/>
           </w:tcPr>
-          <w:p/>
+          <w:p>
+            <w:r>
+              <w:t>Java (JDK 22 / OpenJDK 17+ compatible)</w:t>
+            </w:r>
+          </w:p>
         </w:tc>
       </w:tr>
       <w:tr>
@@ -205,7 +225,11 @@
           <w:tcPr>
             <w:tcW w:w="5184" w:type="dxa"/>
           </w:tcPr>
-          <w:p/>
+          <w:p>
+            <w:r>
+              <w:t>548 records (52 locations, 120 roads, 345 service requests, 31 delivery resources)</w:t>
+            </w:r>
+          </w:p>
         </w:tc>
       </w:tr>
       <w:tr>
@@ -230,7 +254,11 @@
           <w:tcPr>
             <w:tcW w:w="5184" w:type="dxa"/>
           </w:tcPr>
-          <w:p/>
+          <w:p>
+            <w:r>
+              <w:t>VirtusDakura/Joint_Project_DCIT308-DCIT204 (https://github.com/VirtusDakura/Joint_Project_DCIT308-DCIT204)</w:t>
+            </w:r>
+          </w:p>
         </w:tc>
       </w:tr>
     </w:tbl>
@@ -329,13 +357,21 @@
           <w:tcPr>
             <w:tcW w:w="3456" w:type="dxa"/>
           </w:tcPr>
-          <w:p/>
+          <w:p>
+            <w:r>
+              <w:t>[X] Yes</w:t>
+            </w:r>
+          </w:p>
         </w:tc>
         <w:tc>
           <w:tcPr>
             <w:tcW w:w="3456" w:type="dxa"/>
           </w:tcPr>
-          <w:p/>
+          <w:p>
+            <w:r>
+              <w:t>data/locations.csv (52 rows), data/roads.csv (120 rows), data/service_requests.csv (345 rows), data/resources.csv (31 rows); Technical Report Section 10</w:t>
+            </w:r>
+          </w:p>
         </w:tc>
       </w:tr>
       <w:tr>
@@ -360,13 +396,21 @@
           <w:tcPr>
             <w:tcW w:w="3456" w:type="dxa"/>
           </w:tcPr>
-          <w:p/>
+          <w:p>
+            <w:r>
+              <w:t>[X] Yes</w:t>
+            </w:r>
+          </w:p>
         </w:tc>
         <w:tc>
           <w:tcPr>
             <w:tcW w:w="3456" w:type="dxa"/>
           </w:tcPr>
-          <w:p/>
+          <w:p>
+            <w:r>
+              <w:t>data/schema.sql, schema.sql, dsa_optimizer.db, src/main/java/org/ug/dsa/database/DatabaseManager.java</w:t>
+            </w:r>
+          </w:p>
         </w:tc>
       </w:tr>
       <w:tr>
@@ -391,13 +435,21 @@
           <w:tcPr>
             <w:tcW w:w="3456" w:type="dxa"/>
           </w:tcPr>
-          <w:p/>
+          <w:p>
+            <w:r>
+              <w:t>[X] Yes</w:t>
+            </w:r>
+          </w:p>
         </w:tc>
         <w:tc>
           <w:tcPr>
             <w:tcW w:w="3456" w:type="dxa"/>
           </w:tcPr>
-          <w:p/>
+          <w:p>
+            <w:r>
+              <w:t>src/main/java/org/ug/dsa/datastructures/ (14 custom structures: DynamicArray, LinkedList, Stack, Queue, CircularQueue, Deque, Heap, BST, RedBlackTree, BTree, HashTable, Set, Map, DisjointSet, Graph)</w:t>
+            </w:r>
+          </w:p>
         </w:tc>
       </w:tr>
       <w:tr>
@@ -422,13 +474,21 @@
           <w:tcPr>
             <w:tcW w:w="3456" w:type="dxa"/>
           </w:tcPr>
-          <w:p/>
+          <w:p>
+            <w:r>
+              <w:t>[X] Yes</w:t>
+            </w:r>
+          </w:p>
         </w:tc>
         <w:tc>
           <w:tcPr>
             <w:tcW w:w="3456" w:type="dxa"/>
           </w:tcPr>
-          <w:p/>
+          <w:p>
+            <w:r>
+              <w:t>src/main/java/org/ug/dsa/algorithms/search/ (Linear, Binary); src/main/java/org/ug/dsa/algorithms/sorting/ (Selection, Insertion, Merge, QuickSort)</w:t>
+            </w:r>
+          </w:p>
         </w:tc>
       </w:tr>
       <w:tr>
@@ -453,13 +513,21 @@
           <w:tcPr>
             <w:tcW w:w="3456" w:type="dxa"/>
           </w:tcPr>
-          <w:p/>
+          <w:p>
+            <w:r>
+              <w:t>[X] Yes</w:t>
+            </w:r>
+          </w:p>
         </w:tc>
         <w:tc>
           <w:tcPr>
             <w:tcW w:w="3456" w:type="dxa"/>
           </w:tcPr>
-          <w:p/>
+          <w:p>
+            <w:r>
+              <w:t>src/main/java/org/ug/dsa/algorithms/graph/ (BFS, DFS, Dijkstra, Prim, Kruskal); Adjacency List &amp; Matrix in CustomGraph</w:t>
+            </w:r>
+          </w:p>
         </w:tc>
       </w:tr>
       <w:tr>
@@ -484,13 +552,21 @@
           <w:tcPr>
             <w:tcW w:w="3456" w:type="dxa"/>
           </w:tcPr>
-          <w:p/>
+          <w:p>
+            <w:r>
+              <w:t>[X] Yes</w:t>
+            </w:r>
+          </w:p>
         </w:tc>
         <w:tc>
           <w:tcPr>
             <w:tcW w:w="3456" w:type="dxa"/>
           </w:tcPr>
-          <w:p/>
+          <w:p>
+            <w:r>
+              <w:t>src/main/java/org/ug/dsa/algorithms/optimization/ (GreedyBatching, DynamicProgrammingBatching); docs/COUNTEREXAMPLES.md</w:t>
+            </w:r>
+          </w:p>
         </w:tc>
       </w:tr>
       <w:tr>
@@ -515,13 +591,21 @@
           <w:tcPr>
             <w:tcW w:w="3456" w:type="dxa"/>
           </w:tcPr>
-          <w:p/>
+          <w:p>
+            <w:r>
+              <w:t>[X] Yes</w:t>
+            </w:r>
+          </w:p>
         </w:tc>
         <w:tc>
           <w:tcPr>
             <w:tcW w:w="3456" w:type="dxa"/>
           </w:tcPr>
-          <w:p/>
+          <w:p>
+            <w:r>
+              <w:t>src/test/java/org/ug/dsa/ (42 tests, 0 failures); docs/trace-tables/ (Traces 1–7); docs/proof-sketches/ (Proofs 1–3)</w:t>
+            </w:r>
+          </w:p>
         </w:tc>
       </w:tr>
       <w:tr>
@@ -546,13 +630,21 @@
           <w:tcPr>
             <w:tcW w:w="3456" w:type="dxa"/>
           </w:tcPr>
-          <w:p/>
+          <w:p>
+            <w:r>
+              <w:t>[X] Yes</w:t>
+            </w:r>
+          </w:p>
         </w:tc>
         <w:tc>
           <w:tcPr>
             <w:tcW w:w="3456" w:type="dxa"/>
           </w:tcPr>
-          <w:p/>
+          <w:p>
+            <w:r>
+              <w:t>data/algorithm_benchmark_runs.csv, docs/performance-graphs/ (exp1–exp6 JPGs, benchmark_results.csv, and index.html); ReportingService.java</w:t>
+            </w:r>
+          </w:p>
         </w:tc>
       </w:tr>
       <w:tr>
@@ -577,13 +669,21 @@
           <w:tcPr>
             <w:tcW w:w="3456" w:type="dxa"/>
           </w:tcPr>
-          <w:p/>
+          <w:p>
+            <w:r>
+              <w:t>[X] Yes</w:t>
+            </w:r>
+          </w:p>
         </w:tc>
         <w:tc>
           <w:tcPr>
             <w:tcW w:w="3456" w:type="dxa"/>
           </w:tcPr>
-          <w:p/>
+          <w:p>
+            <w:r>
+              <w:t>docs/TECHNICAL_REPORT.md, docs/TECHNICAL_REPORT.docx (comprehensive 17-section report, 50KB+)</w:t>
+            </w:r>
+          </w:p>
         </w:tc>
       </w:tr>
       <w:tr>
@@ -608,13 +708,21 @@
           <w:tcPr>
             <w:tcW w:w="3456" w:type="dxa"/>
           </w:tcPr>
-          <w:p/>
+          <w:p>
+            <w:r>
+              <w:t>[X] Yes</w:t>
+            </w:r>
+          </w:p>
         </w:tc>
         <w:tc>
           <w:tcPr>
             <w:tcW w:w="3456" w:type="dxa"/>
           </w:tcPr>
-          <w:p/>
+          <w:p>
+            <w:r>
+              <w:t>Interactive CLI (Main.java), Section 12–13 in Technical Report (Pod distribution &amp; question defense guides for all 13 members)</w:t>
+            </w:r>
+          </w:p>
         </w:tc>
       </w:tr>
     </w:tbl>

</xml_diff>